<commit_message>
docs: actualizar Protocolo_Scoring v2.2 en sincronía con variables.py
- Escala de pesos 1-3 → 1-5 con descripción actualizada (OR-based)
- Pesos corregidos: historial_lesional 3→5, y_balance 3→4,
  dorsiflexion 3→4, rotadores_externos 2→3, acwr 3→2
- Tríceps sural: LSI mínimo 85% → 90% (estándar retorno al deporte)
- Cuádriceps e isquiotibiales: tabla estratificada completa por
  sexo (M/F) y grupo de edad (18-35 / 36-50 / 51-65)
- ACWR: umbrales planos → estratificados por nivel de actividad
  (sedentario 1.40 / recreacional-activo 1.50 / élite 1.60)
- NRS: aclaración "EVALUACIÓN NO CONCLUYENTE" (no clasifica directo)
- Bloque D: añade 5 variables faltantes (horas_sueño, nivel_actividad,
  edad, género, peso_corporal) con peso y descripción
- PSS-4 y Hooper Index separados en filas independientes
- Nueva sección 2b: umbrales del score ponderado (≥26 alto / ≥18 medio)
- Rellena autor y fecha (TODO eliminados)

Co-Authored-By: Claude Sonnet 4.6 <noreply@anthropic.com>
</commit_message>
<xml_diff>
--- a/docs/Protocolo_Scoring_Roberto_Franco.docx
+++ b/docs/Protocolo_Scoring_Roberto_Franco.docx
@@ -515,7 +515,7 @@
         <w:spacing w:after="200"/>
       </w:pPr>
       <w:r>
-        <w:t>Para cada variable, justifica su inclusión con una referencia bibliográfica y ajusta el umbral de riesgo según la evidencia. Peso: 1 = apoyo, 2 = relevante, 3 = crítica.</w:t>
+        <w:t>Para cada variable se indica el umbral de riesgo (basado en la literatura), el peso en el score ponderado (1 = débil / OR&lt;2 ; 2 = moderado / OR 2-4 ; 3 = relevante / OR&gt;4 ; 4 = muy relevante ; 5 = predictor crítico / mayor evidencia) y la referencia principal. Protocolo v2.2.</w:t>
       </w:r>
     </w:p>
     <w:p>
@@ -761,12 +761,15 @@
           <w:p>
             <w:r>
               <w:rPr>
-                <w:rFonts w:ascii="Arial" w:eastAsia="Arial" w:hAnsi="Arial" w:cs="Arial"/>
-                <w:color w:val="000000"/>
-                <w:sz w:val="18"/>
-                <w:szCs w:val="18"/>
-              </w:rPr>
-              <w:t>&lt; 3.5 N/kg ♂ / &lt; 2.8 N/kg ♀ (adultos activos 18-45 a). LSI &lt; 90% entre miembros.</w:t>
+                <w:b w:val="0"/>
+              </w:rPr>
+              <w:t>Umbral estratificado por sexo, edad y nivel de actividad (× 0.85–1.30):</w:t>
+              <w:br/>
+              <w:t xml:space="preserve">  ♂: 4.0 (18-35) / 3.5 (36-50) / 3.0 (51-65) N/kg</w:t>
+              <w:br/>
+              <w:t xml:space="preserve">  ♀: 3.2 (18-35) / 2.8 (36-50) / 2.4 (51-65) N/kg</w:t>
+              <w:br/>
+              <w:t>LSI &lt; 90% entre miembros.</w:t>
             </w:r>
           </w:p>
         </w:tc>
@@ -790,10 +793,7 @@
           <w:p>
             <w:r>
               <w:rPr>
-                <w:rFonts w:ascii="Arial" w:eastAsia="Arial" w:hAnsi="Arial" w:cs="Arial"/>
-                <w:color w:val="000000"/>
-                <w:sz w:val="18"/>
-                <w:szCs w:val="18"/>
+                <w:b w:val="0"/>
               </w:rPr>
               <w:t>3</w:t>
             </w:r>
@@ -1141,12 +1141,15 @@
           <w:p>
             <w:r>
               <w:rPr>
-                <w:rFonts w:ascii="Arial" w:eastAsia="Arial" w:hAnsi="Arial" w:cs="Arial"/>
-                <w:color w:val="000000"/>
-                <w:sz w:val="18"/>
-                <w:szCs w:val="18"/>
-              </w:rPr>
-              <w:t>&lt; 2.3 N/kg ♂ / &lt; 1.9 N/kg ♀. LSI &lt; 90% entre miembros.</w:t>
+                <w:b w:val="0"/>
+              </w:rPr>
+              <w:t>Umbral estratificado:</w:t>
+              <w:br/>
+              <w:t xml:space="preserve">  ♂: 2.5 (18-35) / 2.2 (36-50) / 1.8 (51-65) N/kg</w:t>
+              <w:br/>
+              <w:t xml:space="preserve">  ♀: 2.1 (18-35) / 1.8 (36-50) / 1.5 (51-65) N/kg</w:t>
+              <w:br/>
+              <w:t>LSI &lt; 90%. H:Q (ISO/HHD) &lt; 0.60 en cualquier miembro.</w:t>
             </w:r>
           </w:p>
         </w:tc>
@@ -1171,10 +1174,7 @@
           <w:p>
             <w:r>
               <w:rPr>
-                <w:rFonts w:ascii="Arial" w:eastAsia="Arial" w:hAnsi="Arial" w:cs="Arial"/>
-                <w:color w:val="000000"/>
-                <w:sz w:val="18"/>
-                <w:szCs w:val="18"/>
+                <w:b w:val="0"/>
               </w:rPr>
               <w:t>3</w:t>
             </w:r>
@@ -1441,10 +1441,7 @@
           <w:p>
             <w:r>
               <w:rPr>
-                <w:rFonts w:ascii="Arial" w:eastAsia="Arial" w:hAnsi="Arial" w:cs="Arial"/>
-                <w:color w:val="000000"/>
-                <w:sz w:val="18"/>
-                <w:szCs w:val="18"/>
+                <w:b w:val="0"/>
               </w:rPr>
               <w:t>3</w:t>
             </w:r>
@@ -1673,10 +1670,7 @@
           <w:p>
             <w:r>
               <w:rPr>
-                <w:rFonts w:ascii="Arial" w:eastAsia="Arial" w:hAnsi="Arial" w:cs="Arial"/>
-                <w:color w:val="000000"/>
-                <w:sz w:val="18"/>
-                <w:szCs w:val="18"/>
+                <w:b w:val="0"/>
               </w:rPr>
               <w:t>3</w:t>
             </w:r>
@@ -1823,12 +1817,11 @@
           <w:p>
             <w:r>
               <w:rPr>
-                <w:rFonts w:ascii="Arial" w:eastAsia="Arial" w:hAnsi="Arial" w:cs="Arial"/>
-                <w:color w:val="000000"/>
-                <w:sz w:val="18"/>
-                <w:szCs w:val="18"/>
-              </w:rPr>
-              <w:t>&lt; 1.0 N/kg ♂ / &lt; 0.8 N/kg ♀. LSI &lt; 85% entre miembros.</w:t>
+                <w:b w:val="0"/>
+              </w:rPr>
+              <w:t>&lt; 1.0 N/kg ♂ / &lt; 0.8 N/kg ♀ (Hollman et al., 2009, HHD directo).</w:t>
+              <w:br/>
+              <w:t>LSI &lt; 85% entre miembros.</w:t>
             </w:r>
           </w:p>
         </w:tc>
@@ -1852,12 +1845,9 @@
           <w:p>
             <w:r>
               <w:rPr>
-                <w:rFonts w:ascii="Arial" w:eastAsia="Arial" w:hAnsi="Arial" w:cs="Arial"/>
-                <w:color w:val="000000"/>
-                <w:sz w:val="18"/>
-                <w:szCs w:val="18"/>
-              </w:rPr>
-              <w:t>2</w:t>
+                <w:b w:val="0"/>
+              </w:rPr>
+              <w:t>3</w:t>
             </w:r>
           </w:p>
         </w:tc>
@@ -2024,10 +2014,7 @@
           <w:p>
             <w:r>
               <w:rPr>
-                <w:rFonts w:ascii="Arial" w:eastAsia="Arial" w:hAnsi="Arial" w:cs="Arial"/>
-                <w:color w:val="000000"/>
-                <w:sz w:val="18"/>
-                <w:szCs w:val="18"/>
+                <w:b w:val="0"/>
               </w:rPr>
               <w:t>2</w:t>
             </w:r>
@@ -2263,52 +2250,15 @@
             </w:pPr>
             <w:r>
               <w:rPr>
-                <w:rFonts w:ascii="Arial" w:eastAsia="Arial" w:hAnsi="Arial" w:cs="Arial"/>
-                <w:color w:val="000000"/>
-                <w:sz w:val="18"/>
-                <w:szCs w:val="18"/>
-              </w:rPr>
-              <w:t xml:space="preserve">&lt; 25 repeticiones </w:t>
-            </w:r>
-            <w:proofErr w:type="gramStart"/>
-            <w:r>
-              <w:rPr>
-                <w:rFonts w:ascii="Arial" w:eastAsia="Arial" w:hAnsi="Arial" w:cs="Arial"/>
-                <w:color w:val="000000"/>
-                <w:sz w:val="18"/>
-                <w:szCs w:val="18"/>
-              </w:rPr>
-              <w:t>single</w:t>
-            </w:r>
-            <w:proofErr w:type="gramEnd"/>
-            <w:r>
-              <w:rPr>
-                <w:rFonts w:ascii="Arial" w:eastAsia="Arial" w:hAnsi="Arial" w:cs="Arial"/>
-                <w:color w:val="000000"/>
-                <w:sz w:val="18"/>
-                <w:szCs w:val="18"/>
-              </w:rPr>
-              <w:t>-</w:t>
-            </w:r>
-            <w:proofErr w:type="spellStart"/>
-            <w:r>
-              <w:rPr>
-                <w:rFonts w:ascii="Arial" w:eastAsia="Arial" w:hAnsi="Arial" w:cs="Arial"/>
-                <w:color w:val="000000"/>
-                <w:sz w:val="18"/>
-                <w:szCs w:val="18"/>
-              </w:rPr>
-              <w:t>leg</w:t>
-            </w:r>
-            <w:proofErr w:type="spellEnd"/>
-            <w:r>
-              <w:rPr>
-                <w:rFonts w:ascii="Arial" w:eastAsia="Arial" w:hAnsi="Arial" w:cs="Arial"/>
-                <w:color w:val="000000"/>
-                <w:sz w:val="18"/>
-                <w:szCs w:val="18"/>
-              </w:rPr>
-              <w:t xml:space="preserve"> o LSI &lt; 85% entre miembros.</w:t>
+                <w:b w:val="0"/>
+              </w:rPr>
+              <w:t>Umbral estratificado:</w:t>
+              <w:br/>
+              <w:t xml:space="preserve">  ♂: 25 (18-35) / 22 (36-50) / 18 (51-65) repeticiones</w:t>
+              <w:br/>
+              <w:t xml:space="preserve">  ♀: 22 (18-35) / 19 (36-50) / 15 (51-65) repeticiones</w:t>
+              <w:br/>
+              <w:t>LSI &lt; 90% entre miembros (estándar retorno al deporte).</w:t>
             </w:r>
           </w:p>
         </w:tc>
@@ -2341,10 +2291,7 @@
             </w:pPr>
             <w:r>
               <w:rPr>
-                <w:rFonts w:ascii="Arial" w:eastAsia="Arial" w:hAnsi="Arial" w:cs="Arial"/>
-                <w:color w:val="000000"/>
-                <w:sz w:val="18"/>
-                <w:szCs w:val="18"/>
+                <w:b w:val="0"/>
               </w:rPr>
               <w:t>2</w:t>
             </w:r>
@@ -2687,12 +2634,9 @@
           <w:p>
             <w:r>
               <w:rPr>
-                <w:rFonts w:ascii="Arial" w:eastAsia="Arial" w:hAnsi="Arial" w:cs="Arial"/>
-                <w:color w:val="000000"/>
-                <w:sz w:val="18"/>
-                <w:szCs w:val="18"/>
-              </w:rPr>
-              <w:t>3</w:t>
+                <w:b w:val="0"/>
+              </w:rPr>
+              <w:t>4</w:t>
             </w:r>
           </w:p>
         </w:tc>
@@ -2936,10 +2880,7 @@
           <w:p>
             <w:r>
               <w:rPr>
-                <w:rFonts w:ascii="Arial" w:eastAsia="Arial" w:hAnsi="Arial" w:cs="Arial"/>
-                <w:color w:val="000000"/>
-                <w:sz w:val="18"/>
-                <w:szCs w:val="18"/>
+                <w:b w:val="0"/>
               </w:rPr>
               <w:t>2</w:t>
             </w:r>
@@ -3157,10 +3098,7 @@
           <w:p>
             <w:r>
               <w:rPr>
-                <w:rFonts w:ascii="Arial" w:eastAsia="Arial" w:hAnsi="Arial" w:cs="Arial"/>
-                <w:color w:val="000000"/>
-                <w:sz w:val="18"/>
-                <w:szCs w:val="18"/>
+                <w:b w:val="0"/>
               </w:rPr>
               <w:t>2</w:t>
             </w:r>
@@ -3556,12 +3494,9 @@
           <w:p>
             <w:r>
               <w:rPr>
-                <w:rFonts w:ascii="Arial" w:eastAsia="Arial" w:hAnsi="Arial" w:cs="Arial"/>
-                <w:color w:val="000000"/>
-                <w:sz w:val="18"/>
-                <w:szCs w:val="18"/>
-              </w:rPr>
-              <w:t>3</w:t>
+                <w:b w:val="0"/>
+              </w:rPr>
+              <w:t>4</w:t>
             </w:r>
           </w:p>
         </w:tc>
@@ -3859,10 +3794,7 @@
           <w:p>
             <w:r>
               <w:rPr>
-                <w:rFonts w:ascii="Arial" w:eastAsia="Arial" w:hAnsi="Arial" w:cs="Arial"/>
-                <w:color w:val="000000"/>
-                <w:sz w:val="18"/>
-                <w:szCs w:val="18"/>
+                <w:b w:val="0"/>
               </w:rPr>
               <w:t>3</w:t>
             </w:r>
@@ -4140,10 +4072,7 @@
           <w:p>
             <w:r>
               <w:rPr>
-                <w:rFonts w:ascii="Arial" w:eastAsia="Arial" w:hAnsi="Arial" w:cs="Arial"/>
-                <w:color w:val="000000"/>
-                <w:sz w:val="18"/>
-                <w:szCs w:val="18"/>
+                <w:b w:val="0"/>
               </w:rPr>
               <w:t>3</w:t>
             </w:r>
@@ -4457,12 +4386,9 @@
           <w:p>
             <w:r>
               <w:rPr>
-                <w:rFonts w:ascii="Arial" w:eastAsia="Arial" w:hAnsi="Arial" w:cs="Arial"/>
-                <w:color w:val="000000"/>
-                <w:sz w:val="18"/>
-                <w:szCs w:val="18"/>
-              </w:rPr>
-              <w:t>3</w:t>
+                <w:b w:val="0"/>
+              </w:rPr>
+              <w:t>5</w:t>
             </w:r>
           </w:p>
         </w:tc>
@@ -4609,12 +4535,9 @@
             </w:pPr>
             <w:r>
               <w:rPr>
-                <w:rFonts w:ascii="Arial" w:eastAsia="Arial" w:hAnsi="Arial" w:cs="Arial"/>
-                <w:color w:val="000000"/>
-                <w:sz w:val="18"/>
-                <w:szCs w:val="18"/>
-              </w:rPr>
-              <w:t>&gt; 5 durante o tras la evaluación. Activa clasificación directa a riesgo alto.</w:t>
+                <w:b w:val="0"/>
+              </w:rPr>
+              <w:t>&gt; 5: evaluación NO CONCLUYENTE (no clasifica directamente como alto riesgo; reprogramar cuando NRS ≤ 3).</w:t>
             </w:r>
           </w:p>
         </w:tc>
@@ -4644,10 +4567,7 @@
             </w:pPr>
             <w:r>
               <w:rPr>
-                <w:rFonts w:ascii="Arial" w:eastAsia="Arial" w:hAnsi="Arial" w:cs="Arial"/>
-                <w:color w:val="000000"/>
-                <w:sz w:val="18"/>
-                <w:szCs w:val="18"/>
+                <w:b w:val="0"/>
               </w:rPr>
               <w:t>3</w:t>
             </w:r>
@@ -4794,12 +4714,19 @@
           <w:p>
             <w:r>
               <w:rPr>
-                <w:rFonts w:ascii="Arial" w:eastAsia="Arial" w:hAnsi="Arial" w:cs="Arial"/>
-                <w:color w:val="000000"/>
-                <w:sz w:val="18"/>
-                <w:szCs w:val="18"/>
-              </w:rPr>
-              <w:t>&lt; 0.8 o &gt; 1.3: riesgo moderado. ≥ 1.5: riesgo alto. Zona segura: 0.8–1.3.</w:t>
+                <w:b w:val="0"/>
+              </w:rPr>
+              <w:t>Zona segura estratificada por nivel de actividad:</w:t>
+              <w:br/>
+              <w:t xml:space="preserve">  Sedentario:    0.80–1.20 (alto ≥ 1.40)</w:t>
+              <w:br/>
+              <w:t xml:space="preserve">  Recreacional:  0.80–1.30 (alto ≥ 1.50)</w:t>
+              <w:br/>
+              <w:t xml:space="preserve">  Activo:        0.80–1.30 (alto ≥ 1.50)</w:t>
+              <w:br/>
+              <w:t xml:space="preserve">  Élite:         0.85–1.40 (alto ≥ 1.60)</w:t>
+              <w:br/>
+              <w:t>ACWR &lt; 0.70–0.80 (según nivel) = desacondicionamiento.</w:t>
             </w:r>
           </w:p>
         </w:tc>
@@ -4824,12 +4751,9 @@
           <w:p>
             <w:r>
               <w:rPr>
-                <w:rFonts w:ascii="Arial" w:eastAsia="Arial" w:hAnsi="Arial" w:cs="Arial"/>
-                <w:color w:val="000000"/>
-                <w:sz w:val="18"/>
-                <w:szCs w:val="18"/>
-              </w:rPr>
-              <w:t>3</w:t>
+                <w:b w:val="0"/>
+              </w:rPr>
+              <w:t>2</w:t>
             </w:r>
           </w:p>
         </w:tc>
@@ -4956,12 +4880,9 @@
           <w:p>
             <w:r>
               <w:rPr>
-                <w:rFonts w:ascii="Arial" w:eastAsia="Arial" w:hAnsi="Arial" w:cs="Arial"/>
-                <w:color w:val="000000"/>
-                <w:sz w:val="18"/>
-                <w:szCs w:val="18"/>
-              </w:rPr>
-              <w:t>Índice estrés/descanso (PSS-4 + Hooper)</w:t>
+                <w:b w:val="0"/>
+              </w:rPr>
+              <w:t>Estrés percibido — PSS-4 (0-16)</w:t>
             </w:r>
           </w:p>
         </w:tc>
@@ -4985,32 +4906,9 @@
           <w:p>
             <w:r>
               <w:rPr>
-                <w:rFonts w:ascii="Arial" w:eastAsia="Arial" w:hAnsi="Arial" w:cs="Arial"/>
-                <w:color w:val="000000"/>
-                <w:sz w:val="18"/>
-                <w:szCs w:val="18"/>
-              </w:rPr>
-              <w:t xml:space="preserve">PSS-4 ≥ 9 (sobre 16) Y/O Hooper </w:t>
-            </w:r>
-            <w:proofErr w:type="spellStart"/>
-            <w:r>
-              <w:rPr>
-                <w:rFonts w:ascii="Arial" w:eastAsia="Arial" w:hAnsi="Arial" w:cs="Arial"/>
-                <w:color w:val="000000"/>
-                <w:sz w:val="18"/>
-                <w:szCs w:val="18"/>
-              </w:rPr>
-              <w:t>Index</w:t>
-            </w:r>
-            <w:proofErr w:type="spellEnd"/>
-            <w:r>
-              <w:rPr>
-                <w:rFonts w:ascii="Arial" w:eastAsia="Arial" w:hAnsi="Arial" w:cs="Arial"/>
-                <w:color w:val="000000"/>
-                <w:sz w:val="18"/>
-                <w:szCs w:val="18"/>
-              </w:rPr>
-              <w:t xml:space="preserve"> ≥ 22 (sobre 28).</w:t>
+                <w:b w:val="0"/>
+              </w:rPr>
+              <w:t>≥ 9: estrés percibido elevado.</w:t>
             </w:r>
           </w:p>
         </w:tc>
@@ -5034,12 +4932,9 @@
           <w:p>
             <w:r>
               <w:rPr>
-                <w:rFonts w:ascii="Arial" w:eastAsia="Arial" w:hAnsi="Arial" w:cs="Arial"/>
-                <w:color w:val="000000"/>
-                <w:sz w:val="18"/>
-                <w:szCs w:val="18"/>
-              </w:rPr>
-              <w:t>2</w:t>
+                <w:b w:val="0"/>
+              </w:rPr>
+              <w:t>1</w:t>
             </w:r>
           </w:p>
         </w:tc>
@@ -5063,132 +4958,9 @@
           <w:p>
             <w:r>
               <w:rPr>
-                <w:rFonts w:ascii="Arial" w:eastAsia="Arial" w:hAnsi="Arial" w:cs="Arial"/>
-                <w:color w:val="000000"/>
-                <w:sz w:val="18"/>
-                <w:szCs w:val="18"/>
-              </w:rPr>
-              <w:t xml:space="preserve">Cohen (1983). J </w:t>
-            </w:r>
-            <w:proofErr w:type="spellStart"/>
-            <w:r>
-              <w:rPr>
-                <w:rFonts w:ascii="Arial" w:eastAsia="Arial" w:hAnsi="Arial" w:cs="Arial"/>
-                <w:color w:val="000000"/>
-                <w:sz w:val="18"/>
-                <w:szCs w:val="18"/>
-              </w:rPr>
-              <w:t>Health</w:t>
-            </w:r>
-            <w:proofErr w:type="spellEnd"/>
-            <w:r>
-              <w:rPr>
-                <w:rFonts w:ascii="Arial" w:eastAsia="Arial" w:hAnsi="Arial" w:cs="Arial"/>
-                <w:color w:val="000000"/>
-                <w:sz w:val="18"/>
-                <w:szCs w:val="18"/>
-              </w:rPr>
-              <w:t xml:space="preserve"> </w:t>
-            </w:r>
-            <w:proofErr w:type="spellStart"/>
-            <w:r>
-              <w:rPr>
-                <w:rFonts w:ascii="Arial" w:eastAsia="Arial" w:hAnsi="Arial" w:cs="Arial"/>
-                <w:color w:val="000000"/>
-                <w:sz w:val="18"/>
-                <w:szCs w:val="18"/>
-              </w:rPr>
-              <w:t>Soc</w:t>
-            </w:r>
-            <w:proofErr w:type="spellEnd"/>
-            <w:r>
-              <w:rPr>
-                <w:rFonts w:ascii="Arial" w:eastAsia="Arial" w:hAnsi="Arial" w:cs="Arial"/>
-                <w:color w:val="000000"/>
-                <w:sz w:val="18"/>
-                <w:szCs w:val="18"/>
-              </w:rPr>
-              <w:t xml:space="preserve"> </w:t>
-            </w:r>
-            <w:proofErr w:type="spellStart"/>
-            <w:r>
-              <w:rPr>
-                <w:rFonts w:ascii="Arial" w:eastAsia="Arial" w:hAnsi="Arial" w:cs="Arial"/>
-                <w:color w:val="000000"/>
-                <w:sz w:val="18"/>
-                <w:szCs w:val="18"/>
-              </w:rPr>
-              <w:t>Behav</w:t>
-            </w:r>
-            <w:proofErr w:type="spellEnd"/>
-            <w:r>
-              <w:rPr>
-                <w:rFonts w:ascii="Arial" w:eastAsia="Arial" w:hAnsi="Arial" w:cs="Arial"/>
-                <w:color w:val="000000"/>
-                <w:sz w:val="18"/>
-                <w:szCs w:val="18"/>
-              </w:rPr>
-              <w:t xml:space="preserve">. Hooper &amp; </w:t>
-            </w:r>
-            <w:proofErr w:type="spellStart"/>
-            <w:r>
-              <w:rPr>
-                <w:rFonts w:ascii="Arial" w:eastAsia="Arial" w:hAnsi="Arial" w:cs="Arial"/>
-                <w:color w:val="000000"/>
-                <w:sz w:val="18"/>
-                <w:szCs w:val="18"/>
-              </w:rPr>
-              <w:t>Mackinnon</w:t>
-            </w:r>
-            <w:proofErr w:type="spellEnd"/>
-            <w:r>
-              <w:rPr>
-                <w:rFonts w:ascii="Arial" w:eastAsia="Arial" w:hAnsi="Arial" w:cs="Arial"/>
-                <w:color w:val="000000"/>
-                <w:sz w:val="18"/>
-                <w:szCs w:val="18"/>
-              </w:rPr>
-              <w:t xml:space="preserve"> (1995). </w:t>
-            </w:r>
-            <w:proofErr w:type="spellStart"/>
-            <w:r>
-              <w:rPr>
-                <w:rFonts w:ascii="Arial" w:eastAsia="Arial" w:hAnsi="Arial" w:cs="Arial"/>
-                <w:color w:val="000000"/>
-                <w:sz w:val="18"/>
-                <w:szCs w:val="18"/>
-              </w:rPr>
-              <w:t>Sports</w:t>
-            </w:r>
-            <w:proofErr w:type="spellEnd"/>
-            <w:r>
-              <w:rPr>
-                <w:rFonts w:ascii="Arial" w:eastAsia="Arial" w:hAnsi="Arial" w:cs="Arial"/>
-                <w:color w:val="000000"/>
-                <w:sz w:val="18"/>
-                <w:szCs w:val="18"/>
-              </w:rPr>
-              <w:t xml:space="preserve"> </w:t>
-            </w:r>
-            <w:proofErr w:type="spellStart"/>
-            <w:r>
-              <w:rPr>
-                <w:rFonts w:ascii="Arial" w:eastAsia="Arial" w:hAnsi="Arial" w:cs="Arial"/>
-                <w:color w:val="000000"/>
-                <w:sz w:val="18"/>
-                <w:szCs w:val="18"/>
-              </w:rPr>
-              <w:t>Med</w:t>
-            </w:r>
-            <w:proofErr w:type="spellEnd"/>
-            <w:r>
-              <w:rPr>
-                <w:rFonts w:ascii="Arial" w:eastAsia="Arial" w:hAnsi="Arial" w:cs="Arial"/>
-                <w:color w:val="000000"/>
-                <w:sz w:val="18"/>
-                <w:szCs w:val="18"/>
-              </w:rPr>
-              <w:t>.</w:t>
+                <w:b w:val="0"/>
+              </w:rPr>
+              <w:t>Cohen et al. (1983). J Health Soc Behav, 24, 385-396.</w:t>
             </w:r>
           </w:p>
         </w:tc>
@@ -5215,12 +4987,9 @@
           <w:p>
             <w:r>
               <w:rPr>
-                <w:rFonts w:ascii="Arial" w:eastAsia="Arial" w:hAnsi="Arial" w:cs="Arial"/>
-                <w:color w:val="000000"/>
-                <w:sz w:val="18"/>
-                <w:szCs w:val="18"/>
-              </w:rPr>
-              <w:t>Perfil de exigencia deportiva (1-5)</w:t>
+                <w:b w:val="0"/>
+              </w:rPr>
+              <w:t>Hooper Index — Bienestar (4-28)</w:t>
             </w:r>
           </w:p>
         </w:tc>
@@ -5245,12 +5014,9 @@
           <w:p>
             <w:r>
               <w:rPr>
-                <w:rFonts w:ascii="Arial" w:eastAsia="Arial" w:hAnsi="Arial" w:cs="Arial"/>
-                <w:color w:val="000000"/>
-                <w:sz w:val="18"/>
-                <w:szCs w:val="18"/>
-              </w:rPr>
-              <w:t>Nivel 4-5: activa umbrales de fuerza +10% más estrictos.</w:t>
+                <w:b w:val="0"/>
+              </w:rPr>
+              <w:t>≥ 22: recuperación insuficiente. Evalúa fatiga, estrés, DOMS y calidad del sueño.</w:t>
             </w:r>
           </w:p>
         </w:tc>
@@ -5275,12 +5041,9 @@
           <w:p>
             <w:r>
               <w:rPr>
-                <w:rFonts w:ascii="Arial" w:eastAsia="Arial" w:hAnsi="Arial" w:cs="Arial"/>
-                <w:color w:val="000000"/>
-                <w:sz w:val="18"/>
-                <w:szCs w:val="18"/>
-              </w:rPr>
-              <w:t>1</w:t>
+                <w:b w:val="0"/>
+              </w:rPr>
+              <w:t>2</w:t>
             </w:r>
           </w:p>
         </w:tc>
@@ -5303,85 +5066,285 @@
             <w:vAlign w:val="center"/>
           </w:tcPr>
           <w:p>
-            <w:proofErr w:type="spellStart"/>
-            <w:r>
-              <w:rPr>
-                <w:rFonts w:ascii="Arial" w:eastAsia="Arial" w:hAnsi="Arial" w:cs="Arial"/>
-                <w:color w:val="000000"/>
-                <w:sz w:val="18"/>
-                <w:szCs w:val="18"/>
-              </w:rPr>
-              <w:t>Tegner</w:t>
-            </w:r>
-            <w:proofErr w:type="spellEnd"/>
-            <w:r>
-              <w:rPr>
-                <w:rFonts w:ascii="Arial" w:eastAsia="Arial" w:hAnsi="Arial" w:cs="Arial"/>
-                <w:color w:val="000000"/>
-                <w:sz w:val="18"/>
-                <w:szCs w:val="18"/>
-              </w:rPr>
-              <w:t xml:space="preserve"> &amp; </w:t>
-            </w:r>
-            <w:proofErr w:type="spellStart"/>
-            <w:r>
-              <w:rPr>
-                <w:rFonts w:ascii="Arial" w:eastAsia="Arial" w:hAnsi="Arial" w:cs="Arial"/>
-                <w:color w:val="000000"/>
-                <w:sz w:val="18"/>
-                <w:szCs w:val="18"/>
-              </w:rPr>
-              <w:t>Lysholm</w:t>
-            </w:r>
-            <w:proofErr w:type="spellEnd"/>
-            <w:r>
-              <w:rPr>
-                <w:rFonts w:ascii="Arial" w:eastAsia="Arial" w:hAnsi="Arial" w:cs="Arial"/>
-                <w:color w:val="000000"/>
-                <w:sz w:val="18"/>
-                <w:szCs w:val="18"/>
-              </w:rPr>
-              <w:t xml:space="preserve"> (1985). Clin </w:t>
-            </w:r>
-            <w:proofErr w:type="spellStart"/>
-            <w:r>
-              <w:rPr>
-                <w:rFonts w:ascii="Arial" w:eastAsia="Arial" w:hAnsi="Arial" w:cs="Arial"/>
-                <w:color w:val="000000"/>
-                <w:sz w:val="18"/>
-                <w:szCs w:val="18"/>
-              </w:rPr>
-              <w:t>Orthop</w:t>
-            </w:r>
-            <w:proofErr w:type="spellEnd"/>
-            <w:r>
-              <w:rPr>
-                <w:rFonts w:ascii="Arial" w:eastAsia="Arial" w:hAnsi="Arial" w:cs="Arial"/>
-                <w:color w:val="000000"/>
-                <w:sz w:val="18"/>
-                <w:szCs w:val="18"/>
-              </w:rPr>
-              <w:t xml:space="preserve"> </w:t>
-            </w:r>
-            <w:proofErr w:type="spellStart"/>
-            <w:r>
-              <w:rPr>
-                <w:rFonts w:ascii="Arial" w:eastAsia="Arial" w:hAnsi="Arial" w:cs="Arial"/>
-                <w:color w:val="000000"/>
-                <w:sz w:val="18"/>
-                <w:szCs w:val="18"/>
-              </w:rPr>
-              <w:t>Relat</w:t>
-            </w:r>
-            <w:proofErr w:type="spellEnd"/>
-            <w:r>
-              <w:rPr>
-                <w:rFonts w:ascii="Arial" w:eastAsia="Arial" w:hAnsi="Arial" w:cs="Arial"/>
-                <w:color w:val="000000"/>
-                <w:sz w:val="18"/>
-                <w:szCs w:val="18"/>
-              </w:rPr>
-              <w:t xml:space="preserve"> Res.</w:t>
+            <w:r>
+              <w:rPr>
+                <w:b w:val="0"/>
+              </w:rPr>
+              <w:t>Hooper &amp; Mackinnon (1995). Sports Med, 20(5), 321-327.</w:t>
+            </w:r>
+          </w:p>
+        </w:tc>
+      </w:tr>
+      <w:tr>
+        <w:tc>
+          <w:tcPr>
+            <w:tcW w:type="dxa" w:w="3000"/>
+          </w:tcPr>
+          <w:p>
+            <w:r>
+              <w:rPr>
+                <w:b w:val="0"/>
+              </w:rPr>
+              <w:t>Horas de sueño/noche</w:t>
+            </w:r>
+          </w:p>
+        </w:tc>
+        <w:tc>
+          <w:tcPr>
+            <w:tcW w:type="dxa" w:w="2200"/>
+          </w:tcPr>
+          <w:p>
+            <w:r>
+              <w:rPr>
+                <w:b w:val="0"/>
+              </w:rPr>
+              <w:t>&lt; 7 h: sueño insuficiente (OR lesión 1.7× en &lt; 8 h, Milewski et al., 2014).</w:t>
+            </w:r>
+          </w:p>
+        </w:tc>
+        <w:tc>
+          <w:tcPr>
+            <w:tcW w:type="dxa" w:w="800"/>
+          </w:tcPr>
+          <w:p>
+            <w:r>
+              <w:rPr>
+                <w:b w:val="0"/>
+              </w:rPr>
+              <w:t>2</w:t>
+            </w:r>
+          </w:p>
+        </w:tc>
+        <w:tc>
+          <w:tcPr>
+            <w:tcW w:type="dxa" w:w="3026"/>
+          </w:tcPr>
+          <w:p>
+            <w:r>
+              <w:rPr>
+                <w:b w:val="0"/>
+              </w:rPr>
+              <w:t>Milewski et al. (2014). Pediatrics, 133(3), e735-740.</w:t>
+            </w:r>
+          </w:p>
+        </w:tc>
+      </w:tr>
+      <w:tr>
+        <w:tc>
+          <w:tcPr>
+            <w:tcW w:type="dxa" w:w="3000"/>
+          </w:tcPr>
+          <w:p>
+            <w:r>
+              <w:rPr>
+                <w:b w:val="0"/>
+              </w:rPr>
+              <w:t>Nivel de actividad deportiva</w:t>
+            </w:r>
+          </w:p>
+        </w:tc>
+        <w:tc>
+          <w:tcPr>
+            <w:tcW w:type="dxa" w:w="2200"/>
+          </w:tcPr>
+          <w:p>
+            <w:r>
+              <w:rPr>
+                <w:b w:val="0"/>
+              </w:rPr>
+              <w:t>Sedentario / Recreacional / Activo / Élite.</w:t>
+              <w:br/>
+              <w:t>Determina el factor multiplicador del umbral (×0.85–1.30) y la fila de ACWR.</w:t>
+              <w:br/>
+              <w:t>No entra directamente en el score (peso = 0).</w:t>
+            </w:r>
+          </w:p>
+        </w:tc>
+        <w:tc>
+          <w:tcPr>
+            <w:tcW w:type="dxa" w:w="800"/>
+          </w:tcPr>
+          <w:p>
+            <w:r>
+              <w:rPr>
+                <w:b w:val="0"/>
+              </w:rPr>
+              <w:t>0</w:t>
+            </w:r>
+          </w:p>
+        </w:tc>
+        <w:tc>
+          <w:tcPr>
+            <w:tcW w:type="dxa" w:w="3026"/>
+          </w:tcPr>
+          <w:p>
+            <w:r>
+              <w:rPr>
+                <w:b w:val="0"/>
+              </w:rPr>
+              <w:t>Protocolo v2.2 sección 2.2.</w:t>
+            </w:r>
+          </w:p>
+        </w:tc>
+      </w:tr>
+      <w:tr>
+        <w:tc>
+          <w:tcPr>
+            <w:tcW w:type="dxa" w:w="3000"/>
+          </w:tcPr>
+          <w:p>
+            <w:r>
+              <w:rPr>
+                <w:b w:val="0"/>
+              </w:rPr>
+              <w:t>Edad (años)</w:t>
+            </w:r>
+          </w:p>
+        </w:tc>
+        <w:tc>
+          <w:tcPr>
+            <w:tcW w:type="dxa" w:w="2200"/>
+          </w:tcPr>
+          <w:p>
+            <w:r>
+              <w:rPr>
+                <w:b w:val="0"/>
+              </w:rPr>
+              <w:t>18-65 años. Selecciona el grupo de edad (18-35 / 36-50 / 51-65) para los umbrales de fuerza. Peso = 0 (variable de estratificación).</w:t>
+            </w:r>
+          </w:p>
+        </w:tc>
+        <w:tc>
+          <w:tcPr>
+            <w:tcW w:type="dxa" w:w="800"/>
+          </w:tcPr>
+          <w:p>
+            <w:r>
+              <w:rPr>
+                <w:b w:val="0"/>
+              </w:rPr>
+              <w:t>0</w:t>
+            </w:r>
+          </w:p>
+        </w:tc>
+        <w:tc>
+          <w:tcPr>
+            <w:tcW w:type="dxa" w:w="3026"/>
+          </w:tcPr>
+          <w:p>
+            <w:r>
+              <w:rPr>
+                <w:b w:val="0"/>
+              </w:rPr>
+              <w:t>Protocolo v2.2.</w:t>
+            </w:r>
+          </w:p>
+        </w:tc>
+      </w:tr>
+      <w:tr>
+        <w:tc>
+          <w:tcPr>
+            <w:tcW w:type="dxa" w:w="3000"/>
+          </w:tcPr>
+          <w:p>
+            <w:r>
+              <w:rPr>
+                <w:b w:val="0"/>
+              </w:rPr>
+              <w:t>Género</w:t>
+            </w:r>
+          </w:p>
+        </w:tc>
+        <w:tc>
+          <w:tcPr>
+            <w:tcW w:type="dxa" w:w="2200"/>
+          </w:tcPr>
+          <w:p>
+            <w:r>
+              <w:rPr>
+                <w:b w:val="0"/>
+              </w:rPr>
+              <w:t>Masculino / Femenino. Selecciona la columna M/F en la tabla de umbrales de fuerza. Peso = 0.</w:t>
+            </w:r>
+          </w:p>
+        </w:tc>
+        <w:tc>
+          <w:tcPr>
+            <w:tcW w:type="dxa" w:w="800"/>
+          </w:tcPr>
+          <w:p>
+            <w:r>
+              <w:rPr>
+                <w:b w:val="0"/>
+              </w:rPr>
+              <w:t>0</w:t>
+            </w:r>
+          </w:p>
+        </w:tc>
+        <w:tc>
+          <w:tcPr>
+            <w:tcW w:type="dxa" w:w="3026"/>
+          </w:tcPr>
+          <w:p>
+            <w:r>
+              <w:rPr>
+                <w:b w:val="0"/>
+              </w:rPr>
+              <w:t>Protocolo v2.2.</w:t>
+            </w:r>
+          </w:p>
+        </w:tc>
+      </w:tr>
+      <w:tr>
+        <w:tc>
+          <w:tcPr>
+            <w:tcW w:type="dxa" w:w="3000"/>
+          </w:tcPr>
+          <w:p>
+            <w:r>
+              <w:rPr>
+                <w:b w:val="0"/>
+              </w:rPr>
+              <w:t>Peso corporal (kg)</w:t>
+            </w:r>
+          </w:p>
+        </w:tc>
+        <w:tc>
+          <w:tcPr>
+            <w:tcW w:type="dxa" w:w="2200"/>
+          </w:tcPr>
+          <w:p>
+            <w:r>
+              <w:rPr>
+                <w:b w:val="0"/>
+              </w:rPr>
+              <w:t>Variable de normalización: convierte fuerza de N a N/kg. No entra en el score (peso = 0).</w:t>
+            </w:r>
+          </w:p>
+        </w:tc>
+        <w:tc>
+          <w:tcPr>
+            <w:tcW w:type="dxa" w:w="800"/>
+          </w:tcPr>
+          <w:p>
+            <w:r>
+              <w:rPr>
+                <w:b w:val="0"/>
+              </w:rPr>
+              <w:t>0</w:t>
+            </w:r>
+          </w:p>
+        </w:tc>
+        <w:tc>
+          <w:tcPr>
+            <w:tcW w:type="dxa" w:w="3026"/>
+          </w:tcPr>
+          <w:p>
+            <w:r>
+              <w:rPr>
+                <w:b w:val="0"/>
+              </w:rPr>
+              <w:t>Protocolo v2.2.</w:t>
             </w:r>
           </w:p>
         </w:tc>
@@ -5449,6 +5412,30 @@
     </w:p>
     <w:p>
       <w:pPr>
+        <w:pStyle w:val="Ttulo2"/>
+      </w:pPr>
+      <w:r>
+        <w:t>2b. Clasificación por score ponderado</w:t>
+      </w:r>
+    </w:p>
+    <w:p>
+      <w:pPr/>
+      <w:r>
+        <w:t>Además de las reglas directas de la sección 3, el sistema aplica un score ponderado acumulado sobre todas las variables. Cuando el score supera los umbrales siguientes, la categoría puede elevarse (pero nunca reducirse):</w:t>
+        <w:br/>
+        <w:br/>
+        <w:t xml:space="preserve">  • Score ≥ 26 → Riesgo ALTO</w:t>
+        <w:br/>
+        <w:t xml:space="preserve">  • Score ≥ 18 (y &lt; 26) → Riesgo MEDIO</w:t>
+        <w:br/>
+        <w:t xml:space="preserve">  • Score &lt; 18 → Riesgo BAJO</w:t>
+        <w:br/>
+        <w:br/>
+        <w:t>Umbrales calibrados con el dataset sintético v2.2 (n=500, semilla=42) para obtener distribución aproximada 50% bajo / 30% medio / 20% alto.</w:t>
+      </w:r>
+    </w:p>
+    <w:p>
+      <w:pPr>
         <w:pStyle w:val="Ttulo1"/>
       </w:pPr>
       <w:r>
@@ -6259,65 +6246,8 @@
           <w:color w:val="000000" w:themeColor="text1"/>
         </w:rPr>
       </w:pPr>
-      <w:proofErr w:type="spellStart"/>
-      <w:r>
-        <w:rPr>
-          <w:rFonts w:ascii="Arial" w:eastAsia="Arial" w:hAnsi="Arial" w:cs="Arial"/>
-          <w:color w:val="000000" w:themeColor="text1"/>
-          <w:sz w:val="20"/>
-          <w:szCs w:val="20"/>
-        </w:rPr>
-        <w:t>Gabbett</w:t>
-      </w:r>
-      <w:proofErr w:type="spellEnd"/>
-      <w:r>
-        <w:rPr>
-          <w:rFonts w:ascii="Arial" w:eastAsia="Arial" w:hAnsi="Arial" w:cs="Arial"/>
-          <w:color w:val="000000" w:themeColor="text1"/>
-          <w:sz w:val="20"/>
-          <w:szCs w:val="20"/>
-        </w:rPr>
-        <w:t xml:space="preserve"> (2016) introdujo el concepto del ACWR como ratio entre la carga aguda (última semana) y la carga crónica (media de las 4 semanas anteriores). La zona segura es 0.8–1.3. Un ACWR ≥ 1.5 se asocia a riesgo significativamente aumentado de lesión aguda y por sobrecarga (Malone et al., 2017). El Comité Olímpico Internacional lo incorporó en su </w:t>
-      </w:r>
-      <w:proofErr w:type="spellStart"/>
-      <w:r>
-        <w:rPr>
-          <w:rFonts w:ascii="Arial" w:eastAsia="Arial" w:hAnsi="Arial" w:cs="Arial"/>
-          <w:color w:val="000000" w:themeColor="text1"/>
-          <w:sz w:val="20"/>
-          <w:szCs w:val="20"/>
-        </w:rPr>
-        <w:t>consensus</w:t>
-      </w:r>
-      <w:proofErr w:type="spellEnd"/>
-      <w:r>
-        <w:rPr>
-          <w:rFonts w:ascii="Arial" w:eastAsia="Arial" w:hAnsi="Arial" w:cs="Arial"/>
-          <w:color w:val="000000" w:themeColor="text1"/>
-          <w:sz w:val="20"/>
-          <w:szCs w:val="20"/>
-        </w:rPr>
-        <w:t xml:space="preserve"> </w:t>
-      </w:r>
-      <w:proofErr w:type="spellStart"/>
-      <w:r>
-        <w:rPr>
-          <w:rFonts w:ascii="Arial" w:eastAsia="Arial" w:hAnsi="Arial" w:cs="Arial"/>
-          <w:color w:val="000000" w:themeColor="text1"/>
-          <w:sz w:val="20"/>
-          <w:szCs w:val="20"/>
-        </w:rPr>
-        <w:t>statement</w:t>
-      </w:r>
-      <w:proofErr w:type="spellEnd"/>
-      <w:r>
-        <w:rPr>
-          <w:rFonts w:ascii="Arial" w:eastAsia="Arial" w:hAnsi="Arial" w:cs="Arial"/>
-          <w:color w:val="000000" w:themeColor="text1"/>
-          <w:sz w:val="20"/>
-          <w:szCs w:val="20"/>
-        </w:rPr>
-        <w:t xml:space="preserve"> de 2016. La clasificación en riesgo ALTO (A6) solo se activa si coincide ACWR ≥ 1.5 con un déficit de fuerza, porque el ACWR aislado en un deportista con musculatura adecuada no es suficiente para la clasificación más severa.</w:t>
+      <w:r>
+        <w:t>Gabbett (2016) introdujo el ACWR como ratio entre la carga aguda (última semana) y la crónica (media de las 4 semanas previas). En v2.2 los umbrales están estratificados por nivel de actividad: zona segura 0.80–1.20 (sedentario) a 0.85–1.40 (élite); riesgo alto ≥ 1.40 (sedentario) a ≥ 1.60 (élite). Windt &amp; Gabbett (2018) advierten que la relación ACWR-lesión no es monotónica (confusión estadística), por lo que el peso del ACWR se ha reducido a 2 en v2.2.</w:t>
       </w:r>
     </w:p>
     <w:p>
@@ -10792,22 +10722,12 @@
         <w:spacing w:before="400"/>
       </w:pPr>
       <w:r>
-        <w:rPr>
-          <w:i/>
-          <w:iCs/>
-          <w:color w:val="999999"/>
-        </w:rPr>
-        <w:t>Última actualización: [TODO ROBERTO — fecha]</w:t>
+        <w:t>Última actualización: mayo 2025 — Protocolo de Scoring Clínico v2.2</w:t>
       </w:r>
     </w:p>
     <w:p>
       <w:r>
-        <w:rPr>
-          <w:i/>
-          <w:iCs/>
-          <w:color w:val="999999"/>
-        </w:rPr>
-        <w:t>Autor: [TODO ROBERTO — nombre completo, titulación, institución]</w:t>
+        <w:t>Autor: Roberto Franco Yagüe | MFP en IA Aplicada al Deporte | Universidad Europea | Tutor: Javier Sánchez Rueda</w:t>
       </w:r>
     </w:p>
     <w:sectPr>

</xml_diff>

<commit_message>
IntApp v2.3 — auditoría completa, re-entrenamiento y limpieza final
Cambios principales:
- Pipeline v2.3 consistente en todos los archivos (sin ACWR, pss4, horas_sueno)
- Dataset procesado regenerado: 4826 × 57 cols (incluye 12 ratio_ref)
- Modelo re-entrenado: F1=0.844, Recall alto=0.964 [IC95%: 0.944–0.981]
- Protocolo_Scoring_Roberto_Franco.docx: eliminadas todas las referencias a ACWR
- Evidencia_Valores_Normativos.md: Bloque E2 con ratio_ref, ACWR retirado
- README actualizado con métricas reales del modelo re-entrenado
- Notebooks 01-06 re-ejecutados sin errores, TODOs y bugs eliminados
- Eliminados archivos obsoletos: modelos experimentales, CSVs con nombre antiguo
- Manual_IntApp_v2.pdf generado
- scripts/generar_shap.py: path CSV corregido

Co-Authored-By: Claude Sonnet 4.6 <noreply@anthropic.com>
</commit_message>
<xml_diff>
--- a/docs/Protocolo_Scoring_Roberto_Franco.docx
+++ b/docs/Protocolo_Scoring_Roberto_Franco.docx
@@ -5199,7 +5199,7 @@
     </w:p>
     <w:p>
       <w:pPr>
-        <w:spacing w:after="80"/>
+        <w:spacing w:before="120"/>
       </w:pPr>
       <w:r>
         <w:rPr>
@@ -5207,20 +5207,7 @@
           <w:sz w:val="20"/>
           <w:szCs w:val="20"/>
         </w:rPr>
-        <w:t>A6: ACWR ≥ 1.5 AND cuádriceps o isquiotibiales &lt; umbral en cualquier miembro.</w:t>
-      </w:r>
-    </w:p>
-    <w:p>
-      <w:pPr>
-        <w:spacing w:before="120"/>
-      </w:pPr>
-      <w:r>
-        <w:rPr>
-          <w:rFonts w:ascii="Arial" w:eastAsia="Arial" w:hAnsi="Arial" w:cs="Arial"/>
-          <w:sz w:val="20"/>
-          <w:szCs w:val="20"/>
-        </w:rPr>
-        <w:t>A7: WBLT &lt; 10 cm bilateral (ambos miembros) AND asimetría &gt; 2.5 cm.</w:t>
+        <w:t>A6: WBLT &lt; 10 cm bilateral (ambos miembros) AND asimetría &gt; 2.5 cm.</w:t>
       </w:r>
     </w:p>
     <w:p>
@@ -5339,37 +5326,6 @@
     </w:p>
     <w:p>
       <w:pPr>
-        <w:spacing w:before="120"/>
-      </w:pPr>
-      <w:r>
-        <w:rPr>
-          <w:rFonts w:ascii="Arial" w:eastAsia="Arial" w:hAnsi="Arial" w:cs="Arial"/>
-          <w:sz w:val="20"/>
-          <w:szCs w:val="20"/>
-        </w:rPr>
-        <w:t xml:space="preserve">M5: ACWR entre 1.3 y 1.5 OR ACWR &lt; 0.8 (carga insuficiente = </w:t>
-      </w:r>
-      <w:proofErr w:type="spellStart"/>
-      <w:r>
-        <w:rPr>
-          <w:rFonts w:ascii="Arial" w:eastAsia="Arial" w:hAnsi="Arial" w:cs="Arial"/>
-          <w:sz w:val="20"/>
-          <w:szCs w:val="20"/>
-        </w:rPr>
-        <w:t>desacondicionamiento</w:t>
-      </w:r>
-      <w:proofErr w:type="spellEnd"/>
-      <w:r>
-        <w:rPr>
-          <w:rFonts w:ascii="Arial" w:eastAsia="Arial" w:hAnsi="Arial" w:cs="Arial"/>
-          <w:sz w:val="20"/>
-          <w:szCs w:val="20"/>
-        </w:rPr>
-        <w:t>).</w:t>
-      </w:r>
-    </w:p>
-    <w:p>
-      <w:pPr>
         <w:pStyle w:val="Ttulo2"/>
       </w:pPr>
       <w:r>
@@ -5386,7 +5342,7 @@
           <w:sz w:val="20"/>
           <w:szCs w:val="20"/>
         </w:rPr>
-        <w:t>El deportista no cumple ninguna condición de riesgo alto ni medio. Todos los indicadores de fuerza, movilidad y control neuromuscular se encuentran dentro de los rangos normativos para su perfil (género, edad, nivel de actividad, ACWR en zona segura).</w:t>
+        <w:t>El deportista no cumple ninguna condición de riesgo alto ni medio. Todos los indicadores de fuerza, movilidad y control neuromuscular se encuentran dentro de los rangos normativos para su perfil (género, edad, nivel de actividad).</w:t>
       </w:r>
     </w:p>
     <w:tbl>
@@ -5855,34 +5811,6 @@
           <w:sz w:val="24"/>
           <w:szCs w:val="24"/>
         </w:rPr>
-        <w:t>ACWR — zona de riesgo ≥ 1.5 [variable nueva]</w:t>
-      </w:r>
-    </w:p>
-    <w:p>
-      <w:pPr>
-        <w:spacing w:after="140"/>
-        <w:rPr>
-          <w:color w:val="000000" w:themeColor="text1"/>
-        </w:rPr>
-      </w:pPr>
-      <w:r>
-        <w:t>Gabbett (2016) introdujo el ACWR como ratio entre la carga aguda (última semana) y la crónica (media de las 4 semanas previas). En v2.3 los umbrales están estratificados por nivel de actividad: zona segura 0.80–1.20 (sedentario) a 0.85–1.40 (élite); riesgo alto ≥ 1.40 (sedentario) a ≥ 1.60 (élite). Windt &amp; Gabbett (2018) advierten que la relación ACWR-lesión no es monotónica (confusión estadística), por lo que el peso del ACWR se ha reducido a 2 en v2.3.</w:t>
-      </w:r>
-    </w:p>
-    <w:p>
-      <w:pPr>
-        <w:pStyle w:val="Ttulo2"/>
-        <w:rPr>
-          <w:color w:val="000000" w:themeColor="text1"/>
-        </w:rPr>
-      </w:pPr>
-      <w:r>
-        <w:rPr>
-          <w:rFonts w:ascii="Arial" w:eastAsia="Arial" w:hAnsi="Arial" w:cs="Arial"/>
-          <w:color w:val="000000" w:themeColor="text1"/>
-          <w:sz w:val="24"/>
-          <w:szCs w:val="24"/>
-        </w:rPr>
         <w:t>Thomas test fusionado</w:t>
       </w:r>
     </w:p>
@@ -6000,60 +5928,6 @@
           <w:szCs w:val="20"/>
         </w:rPr>
         <w:t>Fiabilidad del HHD: ICC inter-evaluador 0.70–0.97 según grupo muscular y protocolo, inferior al dinamómetro isocinético (&gt; 0.95). Los valores absolutos del HHD tienden a subestimar la fuerza en grupos musculares potentes. La estandarización del protocolo y la formación del evaluador son críticas.</w:t>
-      </w:r>
-    </w:p>
-    <w:p>
-      <w:pPr>
-        <w:pStyle w:val="Prrafodelista"/>
-        <w:numPr>
-          <w:ilvl w:val="0"/>
-          <w:numId w:val="4"/>
-        </w:numPr>
-        <w:spacing w:after="90"/>
-      </w:pPr>
-      <w:r>
-        <w:rPr>
-          <w:rFonts w:ascii="Arial" w:eastAsia="Arial" w:hAnsi="Arial" w:cs="Arial"/>
-          <w:sz w:val="20"/>
-          <w:szCs w:val="20"/>
-        </w:rPr>
-        <w:t>ACWR en contexto clínico: la medición rigurosa del ACWR requiere registro sistemático de carga (</w:t>
-      </w:r>
-      <w:proofErr w:type="spellStart"/>
-      <w:r>
-        <w:rPr>
-          <w:rFonts w:ascii="Arial" w:eastAsia="Arial" w:hAnsi="Arial" w:cs="Arial"/>
-          <w:sz w:val="20"/>
-          <w:szCs w:val="20"/>
-        </w:rPr>
-        <w:t>sRPE</w:t>
-      </w:r>
-      <w:proofErr w:type="spellEnd"/>
-      <w:r>
-        <w:rPr>
-          <w:rFonts w:ascii="Arial" w:eastAsia="Arial" w:hAnsi="Arial" w:cs="Arial"/>
-          <w:sz w:val="20"/>
-          <w:szCs w:val="20"/>
-        </w:rPr>
-        <w:t xml:space="preserve"> o GPS). En consulta, puede estimarse mediante la subescala de fatiga del Hooper </w:t>
-      </w:r>
-      <w:proofErr w:type="spellStart"/>
-      <w:r>
-        <w:rPr>
-          <w:rFonts w:ascii="Arial" w:eastAsia="Arial" w:hAnsi="Arial" w:cs="Arial"/>
-          <w:sz w:val="20"/>
-          <w:szCs w:val="20"/>
-        </w:rPr>
-        <w:t>Index</w:t>
-      </w:r>
-      <w:proofErr w:type="spellEnd"/>
-      <w:r>
-        <w:rPr>
-          <w:rFonts w:ascii="Arial" w:eastAsia="Arial" w:hAnsi="Arial" w:cs="Arial"/>
-          <w:sz w:val="20"/>
-          <w:szCs w:val="20"/>
-        </w:rPr>
-        <w:t xml:space="preserve"> como proxy, aunque con menor precisión. Esta limitación debe declararse si se usa el proxy.</w:t>
       </w:r>
     </w:p>
     <w:p>
@@ -9822,512 +9696,6 @@
         </w:rPr>
       </w:pPr>
     </w:p>
-    <w:p>
-      <w:pPr>
-        <w:pStyle w:val="Ttulo2"/>
-        <w:rPr>
-          <w:color w:val="000000" w:themeColor="text1"/>
-        </w:rPr>
-      </w:pPr>
-      <w:r>
-        <w:rPr>
-          <w:rFonts w:ascii="Arial" w:eastAsia="Arial" w:hAnsi="Arial" w:cs="Arial"/>
-          <w:color w:val="000000" w:themeColor="text1"/>
-          <w:sz w:val="24"/>
-          <w:szCs w:val="24"/>
-        </w:rPr>
-        <w:t>D3 — ACWR (</w:t>
-      </w:r>
-      <w:proofErr w:type="spellStart"/>
-      <w:proofErr w:type="gramStart"/>
-      <w:r>
-        <w:rPr>
-          <w:rFonts w:ascii="Arial" w:eastAsia="Arial" w:hAnsi="Arial" w:cs="Arial"/>
-          <w:color w:val="000000" w:themeColor="text1"/>
-          <w:sz w:val="24"/>
-          <w:szCs w:val="24"/>
-        </w:rPr>
-        <w:t>Acute:Chronic</w:t>
-      </w:r>
-      <w:proofErr w:type="spellEnd"/>
-      <w:proofErr w:type="gramEnd"/>
-      <w:r>
-        <w:rPr>
-          <w:rFonts w:ascii="Arial" w:eastAsia="Arial" w:hAnsi="Arial" w:cs="Arial"/>
-          <w:color w:val="000000" w:themeColor="text1"/>
-          <w:sz w:val="24"/>
-          <w:szCs w:val="24"/>
-        </w:rPr>
-        <w:t xml:space="preserve"> </w:t>
-      </w:r>
-      <w:proofErr w:type="spellStart"/>
-      <w:r>
-        <w:rPr>
-          <w:rFonts w:ascii="Arial" w:eastAsia="Arial" w:hAnsi="Arial" w:cs="Arial"/>
-          <w:color w:val="000000" w:themeColor="text1"/>
-          <w:sz w:val="24"/>
-          <w:szCs w:val="24"/>
-        </w:rPr>
-        <w:t>Workload</w:t>
-      </w:r>
-      <w:proofErr w:type="spellEnd"/>
-      <w:r>
-        <w:rPr>
-          <w:rFonts w:ascii="Arial" w:eastAsia="Arial" w:hAnsi="Arial" w:cs="Arial"/>
-          <w:color w:val="000000" w:themeColor="text1"/>
-          <w:sz w:val="24"/>
-          <w:szCs w:val="24"/>
-        </w:rPr>
-        <w:t xml:space="preserve"> Ratio)</w:t>
-      </w:r>
-    </w:p>
-    <w:tbl>
-      <w:tblPr>
-        <w:tblW w:w="9360" w:type="dxa"/>
-        <w:tblBorders>
-          <w:top w:val="single" w:sz="4" w:space="0" w:color="auto"/>
-          <w:left w:val="single" w:sz="4" w:space="0" w:color="auto"/>
-          <w:bottom w:val="single" w:sz="4" w:space="0" w:color="auto"/>
-          <w:right w:val="single" w:sz="4" w:space="0" w:color="auto"/>
-          <w:insideH w:val="single" w:sz="4" w:space="0" w:color="auto"/>
-          <w:insideV w:val="single" w:sz="4" w:space="0" w:color="auto"/>
-        </w:tblBorders>
-        <w:tblCellMar>
-          <w:left w:w="10" w:type="dxa"/>
-          <w:right w:w="10" w:type="dxa"/>
-        </w:tblCellMar>
-        <w:tblLook w:val="04A0" w:firstRow="1" w:lastRow="0" w:firstColumn="1" w:lastColumn="0" w:noHBand="0" w:noVBand="1"/>
-      </w:tblPr>
-      <w:tblGrid>
-        <w:gridCol w:w="2800"/>
-        <w:gridCol w:w="6560"/>
-      </w:tblGrid>
-      <w:tr>
-        <w:tc>
-          <w:tcPr>
-            <w:tcW w:w="2800" w:type="dxa"/>
-            <w:tcBorders>
-              <w:top w:val="single" w:sz="4" w:space="0" w:color="BBBBBB"/>
-              <w:left w:val="single" w:sz="4" w:space="0" w:color="BBBBBB"/>
-              <w:bottom w:val="single" w:sz="4" w:space="0" w:color="BBBBBB"/>
-              <w:right w:val="single" w:sz="4" w:space="0" w:color="BBBBBB"/>
-            </w:tcBorders>
-            <w:shd w:val="clear" w:color="auto" w:fill="EE0000"/>
-            <w:tcMar>
-              <w:top w:w="70" w:type="dxa"/>
-              <w:left w:w="110" w:type="dxa"/>
-              <w:bottom w:w="70" w:type="dxa"/>
-              <w:right w:w="110" w:type="dxa"/>
-            </w:tcMar>
-            <w:vAlign w:val="center"/>
-          </w:tcPr>
-          <w:p>
-            <w:pPr>
-              <w:rPr>
-                <w:color w:val="FFFFFF" w:themeColor="background1"/>
-              </w:rPr>
-            </w:pPr>
-            <w:r>
-              <w:rPr>
-                <w:rFonts w:ascii="Arial" w:eastAsia="Arial" w:hAnsi="Arial" w:cs="Arial"/>
-                <w:b/>
-                <w:bCs/>
-                <w:color w:val="FFFFFF" w:themeColor="background1"/>
-                <w:sz w:val="18"/>
-                <w:szCs w:val="18"/>
-              </w:rPr>
-              <w:t>Ítem</w:t>
-            </w:r>
-          </w:p>
-        </w:tc>
-        <w:tc>
-          <w:tcPr>
-            <w:tcW w:w="6560" w:type="dxa"/>
-            <w:tcBorders>
-              <w:top w:val="single" w:sz="4" w:space="0" w:color="BBBBBB"/>
-              <w:left w:val="single" w:sz="4" w:space="0" w:color="BBBBBB"/>
-              <w:bottom w:val="single" w:sz="4" w:space="0" w:color="BBBBBB"/>
-              <w:right w:val="single" w:sz="4" w:space="0" w:color="BBBBBB"/>
-            </w:tcBorders>
-            <w:shd w:val="clear" w:color="auto" w:fill="EE0000"/>
-            <w:tcMar>
-              <w:top w:w="70" w:type="dxa"/>
-              <w:left w:w="110" w:type="dxa"/>
-              <w:bottom w:w="70" w:type="dxa"/>
-              <w:right w:w="110" w:type="dxa"/>
-            </w:tcMar>
-            <w:vAlign w:val="center"/>
-          </w:tcPr>
-          <w:p>
-            <w:pPr>
-              <w:rPr>
-                <w:color w:val="FFFFFF" w:themeColor="background1"/>
-              </w:rPr>
-            </w:pPr>
-            <w:r>
-              <w:rPr>
-                <w:rFonts w:ascii="Arial" w:eastAsia="Arial" w:hAnsi="Arial" w:cs="Arial"/>
-                <w:b/>
-                <w:bCs/>
-                <w:color w:val="FFFFFF" w:themeColor="background1"/>
-                <w:sz w:val="18"/>
-                <w:szCs w:val="18"/>
-              </w:rPr>
-              <w:t>Descripción</w:t>
-            </w:r>
-          </w:p>
-        </w:tc>
-      </w:tr>
-      <w:tr>
-        <w:tc>
-          <w:tcPr>
-            <w:tcW w:w="2800" w:type="dxa"/>
-            <w:tcBorders>
-              <w:top w:val="single" w:sz="4" w:space="0" w:color="BBBBBB"/>
-              <w:left w:val="single" w:sz="4" w:space="0" w:color="BBBBBB"/>
-              <w:bottom w:val="single" w:sz="4" w:space="0" w:color="BBBBBB"/>
-              <w:right w:val="single" w:sz="4" w:space="0" w:color="BBBBBB"/>
-            </w:tcBorders>
-            <w:shd w:val="clear" w:color="auto" w:fill="FFFFFF"/>
-            <w:tcMar>
-              <w:top w:w="70" w:type="dxa"/>
-              <w:left w:w="110" w:type="dxa"/>
-              <w:bottom w:w="70" w:type="dxa"/>
-              <w:right w:w="110" w:type="dxa"/>
-            </w:tcMar>
-            <w:vAlign w:val="center"/>
-          </w:tcPr>
-          <w:p>
-            <w:pPr>
-              <w:rPr>
-                <w:color w:val="000000" w:themeColor="text1"/>
-              </w:rPr>
-            </w:pPr>
-            <w:r>
-              <w:rPr>
-                <w:rFonts w:ascii="Arial" w:eastAsia="Arial" w:hAnsi="Arial" w:cs="Arial"/>
-                <w:b/>
-                <w:bCs/>
-                <w:color w:val="000000" w:themeColor="text1"/>
-                <w:sz w:val="18"/>
-                <w:szCs w:val="18"/>
-              </w:rPr>
-              <w:t>Definición</w:t>
-            </w:r>
-          </w:p>
-        </w:tc>
-        <w:tc>
-          <w:tcPr>
-            <w:tcW w:w="6560" w:type="dxa"/>
-            <w:tcBorders>
-              <w:top w:val="single" w:sz="4" w:space="0" w:color="BBBBBB"/>
-              <w:left w:val="single" w:sz="4" w:space="0" w:color="BBBBBB"/>
-              <w:bottom w:val="single" w:sz="4" w:space="0" w:color="BBBBBB"/>
-              <w:right w:val="single" w:sz="4" w:space="0" w:color="BBBBBB"/>
-            </w:tcBorders>
-            <w:shd w:val="clear" w:color="auto" w:fill="FFFFFF"/>
-            <w:tcMar>
-              <w:top w:w="70" w:type="dxa"/>
-              <w:left w:w="110" w:type="dxa"/>
-              <w:bottom w:w="70" w:type="dxa"/>
-              <w:right w:w="110" w:type="dxa"/>
-            </w:tcMar>
-            <w:vAlign w:val="center"/>
-          </w:tcPr>
-          <w:p>
-            <w:pPr>
-              <w:rPr>
-                <w:color w:val="000000" w:themeColor="text1"/>
-              </w:rPr>
-            </w:pPr>
-            <w:r>
-              <w:rPr>
-                <w:rFonts w:ascii="Arial" w:eastAsia="Arial" w:hAnsi="Arial" w:cs="Arial"/>
-                <w:color w:val="000000" w:themeColor="text1"/>
-                <w:sz w:val="18"/>
-                <w:szCs w:val="18"/>
-              </w:rPr>
-              <w:t>Ratio entre la carga de entrenamiento de la última semana (aguda) y la media de las 4 semanas anteriores (crónica).</w:t>
-            </w:r>
-          </w:p>
-        </w:tc>
-      </w:tr>
-      <w:tr>
-        <w:tc>
-          <w:tcPr>
-            <w:tcW w:w="2800" w:type="dxa"/>
-            <w:tcBorders>
-              <w:top w:val="single" w:sz="4" w:space="0" w:color="BBBBBB"/>
-              <w:left w:val="single" w:sz="4" w:space="0" w:color="BBBBBB"/>
-              <w:bottom w:val="single" w:sz="4" w:space="0" w:color="BBBBBB"/>
-              <w:right w:val="single" w:sz="4" w:space="0" w:color="BBBBBB"/>
-            </w:tcBorders>
-            <w:shd w:val="clear" w:color="auto" w:fill="F5F5F5"/>
-            <w:tcMar>
-              <w:top w:w="70" w:type="dxa"/>
-              <w:left w:w="110" w:type="dxa"/>
-              <w:bottom w:w="70" w:type="dxa"/>
-              <w:right w:w="110" w:type="dxa"/>
-            </w:tcMar>
-            <w:vAlign w:val="center"/>
-          </w:tcPr>
-          <w:p>
-            <w:pPr>
-              <w:rPr>
-                <w:color w:val="000000" w:themeColor="text1"/>
-              </w:rPr>
-            </w:pPr>
-            <w:r>
-              <w:rPr>
-                <w:rFonts w:ascii="Arial" w:eastAsia="Arial" w:hAnsi="Arial" w:cs="Arial"/>
-                <w:b/>
-                <w:bCs/>
-                <w:color w:val="000000" w:themeColor="text1"/>
-                <w:sz w:val="18"/>
-                <w:szCs w:val="18"/>
-              </w:rPr>
-              <w:t xml:space="preserve">Cálculo con </w:t>
-            </w:r>
-            <w:proofErr w:type="spellStart"/>
-            <w:r>
-              <w:rPr>
-                <w:rFonts w:ascii="Arial" w:eastAsia="Arial" w:hAnsi="Arial" w:cs="Arial"/>
-                <w:b/>
-                <w:bCs/>
-                <w:color w:val="000000" w:themeColor="text1"/>
-                <w:sz w:val="18"/>
-                <w:szCs w:val="18"/>
-              </w:rPr>
-              <w:t>sRPE</w:t>
-            </w:r>
-            <w:proofErr w:type="spellEnd"/>
-          </w:p>
-        </w:tc>
-        <w:tc>
-          <w:tcPr>
-            <w:tcW w:w="6560" w:type="dxa"/>
-            <w:tcBorders>
-              <w:top w:val="single" w:sz="4" w:space="0" w:color="BBBBBB"/>
-              <w:left w:val="single" w:sz="4" w:space="0" w:color="BBBBBB"/>
-              <w:bottom w:val="single" w:sz="4" w:space="0" w:color="BBBBBB"/>
-              <w:right w:val="single" w:sz="4" w:space="0" w:color="BBBBBB"/>
-            </w:tcBorders>
-            <w:shd w:val="clear" w:color="auto" w:fill="F5F5F5"/>
-            <w:tcMar>
-              <w:top w:w="70" w:type="dxa"/>
-              <w:left w:w="110" w:type="dxa"/>
-              <w:bottom w:w="70" w:type="dxa"/>
-              <w:right w:w="110" w:type="dxa"/>
-            </w:tcMar>
-            <w:vAlign w:val="center"/>
-          </w:tcPr>
-          <w:p>
-            <w:pPr>
-              <w:rPr>
-                <w:color w:val="000000" w:themeColor="text1"/>
-              </w:rPr>
-            </w:pPr>
-            <w:r>
-              <w:rPr>
-                <w:rFonts w:ascii="Arial" w:eastAsia="Arial" w:hAnsi="Arial" w:cs="Arial"/>
-                <w:color w:val="000000" w:themeColor="text1"/>
-                <w:sz w:val="18"/>
-                <w:szCs w:val="18"/>
-              </w:rPr>
-              <w:t>Carga sesión = RPE (escala 0-10 Borg CR10) × duración en minutos. ACWR = Σ carga última semana / media Σ carga 4 semanas anteriores.</w:t>
-            </w:r>
-          </w:p>
-        </w:tc>
-      </w:tr>
-      <w:tr>
-        <w:tc>
-          <w:tcPr>
-            <w:tcW w:w="2800" w:type="dxa"/>
-            <w:tcBorders>
-              <w:top w:val="single" w:sz="4" w:space="0" w:color="BBBBBB"/>
-              <w:left w:val="single" w:sz="4" w:space="0" w:color="BBBBBB"/>
-              <w:bottom w:val="single" w:sz="4" w:space="0" w:color="BBBBBB"/>
-              <w:right w:val="single" w:sz="4" w:space="0" w:color="BBBBBB"/>
-            </w:tcBorders>
-            <w:shd w:val="clear" w:color="auto" w:fill="FFFFFF"/>
-            <w:tcMar>
-              <w:top w:w="70" w:type="dxa"/>
-              <w:left w:w="110" w:type="dxa"/>
-              <w:bottom w:w="70" w:type="dxa"/>
-              <w:right w:w="110" w:type="dxa"/>
-            </w:tcMar>
-            <w:vAlign w:val="center"/>
-          </w:tcPr>
-          <w:p>
-            <w:pPr>
-              <w:rPr>
-                <w:color w:val="000000" w:themeColor="text1"/>
-              </w:rPr>
-            </w:pPr>
-            <w:r>
-              <w:rPr>
-                <w:rFonts w:ascii="Arial" w:eastAsia="Arial" w:hAnsi="Arial" w:cs="Arial"/>
-                <w:b/>
-                <w:bCs/>
-                <w:color w:val="000000" w:themeColor="text1"/>
-                <w:sz w:val="18"/>
-                <w:szCs w:val="18"/>
-              </w:rPr>
-              <w:t>Proxy clínico</w:t>
-            </w:r>
-          </w:p>
-        </w:tc>
-        <w:tc>
-          <w:tcPr>
-            <w:tcW w:w="6560" w:type="dxa"/>
-            <w:tcBorders>
-              <w:top w:val="single" w:sz="4" w:space="0" w:color="BBBBBB"/>
-              <w:left w:val="single" w:sz="4" w:space="0" w:color="BBBBBB"/>
-              <w:bottom w:val="single" w:sz="4" w:space="0" w:color="BBBBBB"/>
-              <w:right w:val="single" w:sz="4" w:space="0" w:color="BBBBBB"/>
-            </w:tcBorders>
-            <w:shd w:val="clear" w:color="auto" w:fill="FFFFFF"/>
-            <w:tcMar>
-              <w:top w:w="70" w:type="dxa"/>
-              <w:left w:w="110" w:type="dxa"/>
-              <w:bottom w:w="70" w:type="dxa"/>
-              <w:right w:w="110" w:type="dxa"/>
-            </w:tcMar>
-            <w:vAlign w:val="center"/>
-          </w:tcPr>
-          <w:p>
-            <w:pPr>
-              <w:rPr>
-                <w:color w:val="000000" w:themeColor="text1"/>
-              </w:rPr>
-            </w:pPr>
-            <w:r>
-              <w:rPr>
-                <w:rFonts w:ascii="Arial" w:eastAsia="Arial" w:hAnsi="Arial" w:cs="Arial"/>
-                <w:color w:val="000000" w:themeColor="text1"/>
-                <w:sz w:val="18"/>
-                <w:szCs w:val="18"/>
-              </w:rPr>
-              <w:t xml:space="preserve">Si no hay registro de carga estructurado: utilizar la subescala «Fatiga» del Hooper </w:t>
-            </w:r>
-            <w:proofErr w:type="spellStart"/>
-            <w:r>
-              <w:rPr>
-                <w:rFonts w:ascii="Arial" w:eastAsia="Arial" w:hAnsi="Arial" w:cs="Arial"/>
-                <w:color w:val="000000" w:themeColor="text1"/>
-                <w:sz w:val="18"/>
-                <w:szCs w:val="18"/>
-              </w:rPr>
-              <w:t>Index</w:t>
-            </w:r>
-            <w:proofErr w:type="spellEnd"/>
-            <w:r>
-              <w:rPr>
-                <w:rFonts w:ascii="Arial" w:eastAsia="Arial" w:hAnsi="Arial" w:cs="Arial"/>
-                <w:color w:val="000000" w:themeColor="text1"/>
-                <w:sz w:val="18"/>
-                <w:szCs w:val="18"/>
-              </w:rPr>
-              <w:t xml:space="preserve"> (1-7). Fatiga ≥ 6 en las últimas 3 semanas activa bandera equivalente a ACWR &gt; 1.3.</w:t>
-            </w:r>
-          </w:p>
-        </w:tc>
-      </w:tr>
-      <w:tr>
-        <w:tc>
-          <w:tcPr>
-            <w:tcW w:w="2800" w:type="dxa"/>
-            <w:tcBorders>
-              <w:top w:val="single" w:sz="4" w:space="0" w:color="BBBBBB"/>
-              <w:left w:val="single" w:sz="4" w:space="0" w:color="BBBBBB"/>
-              <w:bottom w:val="single" w:sz="4" w:space="0" w:color="BBBBBB"/>
-              <w:right w:val="single" w:sz="4" w:space="0" w:color="BBBBBB"/>
-            </w:tcBorders>
-            <w:shd w:val="clear" w:color="auto" w:fill="F5F5F5"/>
-            <w:tcMar>
-              <w:top w:w="70" w:type="dxa"/>
-              <w:left w:w="110" w:type="dxa"/>
-              <w:bottom w:w="70" w:type="dxa"/>
-              <w:right w:w="110" w:type="dxa"/>
-            </w:tcMar>
-            <w:vAlign w:val="center"/>
-          </w:tcPr>
-          <w:p>
-            <w:pPr>
-              <w:rPr>
-                <w:color w:val="000000" w:themeColor="text1"/>
-              </w:rPr>
-            </w:pPr>
-            <w:r>
-              <w:rPr>
-                <w:rFonts w:ascii="Arial" w:eastAsia="Arial" w:hAnsi="Arial" w:cs="Arial"/>
-                <w:b/>
-                <w:bCs/>
-                <w:color w:val="000000" w:themeColor="text1"/>
-                <w:sz w:val="18"/>
-                <w:szCs w:val="18"/>
-              </w:rPr>
-              <w:t>Zona segura</w:t>
-            </w:r>
-          </w:p>
-        </w:tc>
-        <w:tc>
-          <w:tcPr>
-            <w:tcW w:w="6560" w:type="dxa"/>
-            <w:tcBorders>
-              <w:top w:val="single" w:sz="4" w:space="0" w:color="BBBBBB"/>
-              <w:left w:val="single" w:sz="4" w:space="0" w:color="BBBBBB"/>
-              <w:bottom w:val="single" w:sz="4" w:space="0" w:color="BBBBBB"/>
-              <w:right w:val="single" w:sz="4" w:space="0" w:color="BBBBBB"/>
-            </w:tcBorders>
-            <w:shd w:val="clear" w:color="auto" w:fill="F5F5F5"/>
-            <w:tcMar>
-              <w:top w:w="70" w:type="dxa"/>
-              <w:left w:w="110" w:type="dxa"/>
-              <w:bottom w:w="70" w:type="dxa"/>
-              <w:right w:w="110" w:type="dxa"/>
-            </w:tcMar>
-            <w:vAlign w:val="center"/>
-          </w:tcPr>
-          <w:p>
-            <w:pPr>
-              <w:rPr>
-                <w:color w:val="000000" w:themeColor="text1"/>
-              </w:rPr>
-            </w:pPr>
-            <w:r>
-              <w:rPr>
-                <w:rFonts w:ascii="Arial" w:eastAsia="Arial" w:hAnsi="Arial" w:cs="Arial"/>
-                <w:color w:val="000000" w:themeColor="text1"/>
-                <w:sz w:val="18"/>
-                <w:szCs w:val="18"/>
-              </w:rPr>
-              <w:t xml:space="preserve">ACWR 0.8–1.3 = riesgo bajo. 1.3–1.5 = riesgo moderado (M5). ≥ 1.5 = riesgo alto si coincide con déficit de fuerza (A6). &lt; 0.8 = </w:t>
-            </w:r>
-            <w:proofErr w:type="spellStart"/>
-            <w:r>
-              <w:rPr>
-                <w:rFonts w:ascii="Arial" w:eastAsia="Arial" w:hAnsi="Arial" w:cs="Arial"/>
-                <w:color w:val="000000" w:themeColor="text1"/>
-                <w:sz w:val="18"/>
-                <w:szCs w:val="18"/>
-              </w:rPr>
-              <w:t>desacondicionamiento</w:t>
-            </w:r>
-            <w:proofErr w:type="spellEnd"/>
-            <w:r>
-              <w:rPr>
-                <w:rFonts w:ascii="Arial" w:eastAsia="Arial" w:hAnsi="Arial" w:cs="Arial"/>
-                <w:color w:val="000000" w:themeColor="text1"/>
-                <w:sz w:val="18"/>
-                <w:szCs w:val="18"/>
-              </w:rPr>
-              <w:t xml:space="preserve"> (M5).</w:t>
-            </w:r>
-          </w:p>
-        </w:tc>
-      </w:tr>
-    </w:tbl>
     <w:p>
       <w:pPr>
         <w:spacing w:before="360"/>

</xml_diff>